<commit_message>
feat: VASP Act notes — open with thanks paragraph, smoother phrasing
</commit_message>
<xml_diff>
--- a/public/files/vasp-act-legislative-notes/VASP-Act-Reflections-EN_JuChunKO.docx
+++ b/public/files/vasp-act-legislative-notes/VASP-Act-Reflections-EN_JuChunKO.docx
@@ -2,7 +2,7 @@
 <file path=word/document.xml><?xml version="1.0" encoding="utf-8"?>
 <w:document xmlns:w="http://schemas.openxmlformats.org/wordprocessingml/2006/main" xmlns:m="http://schemas.openxmlformats.org/officeDocument/2006/math" xmlns:r="http://schemas.openxmlformats.org/officeDocument/2006/relationships" xmlns:o="urn:schemas-microsoft-com:office:office" xmlns:v="urn:schemas-microsoft-com:vml" xmlns:w10="urn:schemas-microsoft-com:office:word" xmlns:a="http://schemas.openxmlformats.org/drawingml/2006/main" xmlns:pic="http://schemas.openxmlformats.org/drawingml/2006/picture" xmlns:wp="http://schemas.openxmlformats.org/drawingml/2006/wordprocessingDrawing">
   <w:body>
-    <w:bookmarkStart w:id="89" w:name="Xd0810d9af1e204b7f781296aa4d27e1e3b89d68"/>
+    <w:bookmarkStart w:id="90" w:name="Xd0810d9af1e204b7f781296aa4d27e1e3b89d68"/>
     <w:p>
       <w:pPr>
         <w:pStyle w:val="Heading1"/>
@@ -33,20 +33,6 @@
           <w:iCs/>
         </w:rPr>
         <w:t xml:space="preserve">From the bill I introduced on March 20, 2026, to the day the Finance Committee of the Legislative Yuan passed its review on June 3, I was personally involved in every critical moment of Taiwan's first Virtual Asset Services Act. This is the first-hand account I am leaving for the Taiwan of the next decade.</w:t>
-      </w:r>
-    </w:p>
-    <w:p>
-      <w:pPr>
-        <w:pStyle w:val="BlockText"/>
-      </w:pPr>
-      <w:r>
-        <w:t xml:space="preserve">"Parliament needs to be ahead of the curve, and AI needs to actually ship. We need a more advanced way of thinking about regulation — to embrace virtual technology, to live within virtual worlds, to harness virtual intelligence, to fight virtual crime, to help Taiwan, to connect with the world."</w:t>
-      </w:r>
-      <w:r>
-        <w:t xml:space="preserve"> </w:t>
-      </w:r>
-      <w:r>
-        <w:t xml:space="preserve">— That was the political promise I made when I took office in 2024. I hope this Virtual Asset Services Act counts as partially fulfilling it.</w:t>
       </w:r>
     </w:p>
     <w:p>
@@ -56,13 +42,13 @@
         </w:pict>
       </w:r>
     </w:p>
-    <w:bookmarkStart w:id="9" w:name="preface-june-3rd"/>
+    <w:bookmarkStart w:id="9" w:name="good-news-and-a-few-thank-yous"/>
     <w:p>
       <w:pPr>
         <w:pStyle w:val="Heading2"/>
       </w:pPr>
       <w:r>
-        <w:t xml:space="preserve">Preface: June 3rd</w:t>
+        <w:t xml:space="preserve">Good News, and a Few Thank-Yous</w:t>
       </w:r>
     </w:p>
     <w:p>
@@ -70,84 +56,67 @@
         <w:pStyle w:val="FirstParagraph"/>
       </w:pPr>
       <w:r>
-        <w:t xml:space="preserve">A little past ten in the morning, in the Finance Committee meeting room of the Legislative Yuan, I watched the staff read the thick draft clauses one by one, and I watched the chair bring down the gavel on the review's passage. My feelings were complicated.</w:t>
-      </w:r>
-    </w:p>
-    <w:p>
-      <w:pPr>
-        <w:pStyle w:val="BodyText"/>
-      </w:pPr>
-      <w:r>
-        <w:t xml:space="preserve">It wasn't the joy of "winning a war." It felt more like finally crossing a relay point in a long-distance run — you know there is still the second reading, the third reading, the secondary legislation, the first VASP license, the first enforcement action, the first victim's restitution case, and each of those will be another challenge. But you also know that this relay point cannot be retreated from.</w:t>
-      </w:r>
-    </w:p>
-    <w:p>
-      <w:pPr>
-        <w:pStyle w:val="BodyText"/>
-      </w:pPr>
-      <w:r>
-        <w:t xml:space="preserve">Over the past eight years, I went from academia to Dentsu, from Dentsu to parliament, from a person who wrote code to a person who wrote bills. I watched Taiwan's virtual asset industry grow from a grassroots era, through the AML registration era, into today — an era where it finally has its own dedicated statute. The 56 clauses that passed review today will determine how many service providers can survive on this island, how many investors will be able to recover what they really lost after being defrauded, how many stablecoins will be allowed to circulate legally in Taiwan, and how many new technologies will</w:t>
-      </w:r>
-      <w:r>
-        <w:t xml:space="preserve"> </w:t>
-      </w:r>
-      <w:r>
-        <w:rPr>
-          <w:i/>
-          <w:iCs/>
-        </w:rPr>
-        <w:t xml:space="preserve">not</w:t>
-      </w:r>
-      <w:r>
-        <w:t xml:space="preserve"> </w:t>
-      </w:r>
-      <w:r>
-        <w:t xml:space="preserve">be killed accidentally by the law.</w:t>
-      </w:r>
-    </w:p>
-    <w:p>
-      <w:pPr>
-        <w:pStyle w:val="BodyText"/>
-      </w:pPr>
-      <w:r>
-        <w:t xml:space="preserve">There is one thing I am certain of:</w:t>
-      </w:r>
-      <w:r>
-        <w:t xml:space="preserve"> </w:t>
-      </w:r>
-      <w:r>
-        <w:rPr>
-          <w:b/>
-          <w:bCs/>
-        </w:rPr>
-        <w:t xml:space="preserve">this law is written for living people, not for clauses on a page</w:t>
-      </w:r>
-      <w:r>
-        <w:t xml:space="preserve">.</w:t>
-      </w:r>
-    </w:p>
-    <w:p>
-      <w:pPr>
-        <w:pStyle w:val="BodyText"/>
-      </w:pPr>
-      <w:r>
-        <w:t xml:space="preserve">So in this notebook, I want to honestly write down my "thinking" and my "substantive contributions" on this law. Which fights I held the line on and where the text actually changed; which fights I retreated on but managed to preserve in spirit through supplementary resolutions or legislative explanations; which fights I lost and now have to put on the to-do list for later.</w:t>
-      </w:r>
-    </w:p>
-    <w:p>
-      <w:pPr>
-        <w:pStyle w:val="BodyText"/>
-      </w:pPr>
-      <w:r>
-        <w:t xml:space="preserve">I do not want to write this in the tone of a political press release. This law is too important to be wrapped in empty words.</w:t>
-      </w:r>
-    </w:p>
-    <w:p>
-      <w:pPr>
-        <w:pStyle w:val="BodyText"/>
-      </w:pPr>
-      <w:r>
-        <w:t xml:space="preserve">This piece is long, because every clause in this law deserves a serious accounting. If you only want the conclusion, jump to the influence-rating table at the end. If you are willing to walk the journey with me, start from Chapter One.</w:t>
+        <w:rPr>
+          <w:b/>
+          <w:bCs/>
+        </w:rPr>
+        <w:t xml:space="preserve">The Virtual Asset Services Act has cleared the committee — no inter-party negotiation needed; a third reading within this legislative session is now in sight ✅</w:t>
+      </w:r>
+    </w:p>
+    <w:p>
+      <w:pPr>
+        <w:pStyle w:val="BodyText"/>
+      </w:pPr>
+      <w:r>
+        <w:t xml:space="preserve">Before I begin this notebook, allow me to thank a few people. The fact that this law made it out of committee on June 3 with consensus on every single clause, requiring no further inter-party negotiation, is the result of years of work by many people:</w:t>
+      </w:r>
+    </w:p>
+    <w:p>
+      <w:pPr>
+        <w:pStyle w:val="BodyText"/>
+      </w:pPr>
+      <w:r>
+        <w:t xml:space="preserve">I am grateful to the Legislative Yuan, to Finance Committee Convener Legislator Lee Yen-Hsiu, to the Executive Yuan, to the Financial Supervisory Commission, to FSC Chairperson Peng Chin-Lung, to the Central Bank, and to all my colleagues across party lines on the Finance Committee — in particular the senior and powerful Legislator Lai Shyh-Bao for his unwavering support ⬆️</w:t>
+      </w:r>
+    </w:p>
+    <w:p>
+      <w:pPr>
+        <w:pStyle w:val="BodyText"/>
+      </w:pPr>
+      <w:r>
+        <w:rPr>
+          <w:b/>
+          <w:bCs/>
+        </w:rPr>
+        <w:t xml:space="preserve">This is the Republic of China's first Virtual Asset Services Act, passed through committee without need for negotiation, with every clause agreed by consensus.</w:t>
+      </w:r>
+      <w:r>
+        <w:t xml:space="preserve"> </w:t>
+      </w:r>
+      <w:r>
+        <w:t xml:space="preserve">I look forward to Taiwan, late to the game but ahead in execution, becoming not only an Asia-Pacific financial hub but a global digital finance hub.</w:t>
+      </w:r>
+    </w:p>
+    <w:p>
+      <w:pPr>
+        <w:pStyle w:val="BodyText"/>
+      </w:pPr>
+      <w:r>
+        <w:t xml:space="preserve">What follows is my own thinking, convictions, compromises, and reflections along the way.</w:t>
+      </w:r>
+    </w:p>
+    <w:p>
+      <w:pPr>
+        <w:pStyle w:val="BlockText"/>
+      </w:pPr>
+      <w:r>
+        <w:t xml:space="preserve">"Parliament needs to be ahead of the curve, and AI needs to actually ship. We need a more advanced way of thinking about regulation — to embrace virtual technology, to live within virtual worlds, to harness virtual intelligence, to fight virtual crime, to help Taiwan, to connect with the world."</w:t>
+      </w:r>
+      <w:r>
+        <w:t xml:space="preserve"> </w:t>
+      </w:r>
+      <w:r>
+        <w:t xml:space="preserve">— That was the political promise I made when I took office in 2024. I hope this Virtual Asset Services Act counts as partially fulfilling it.</w:t>
       </w:r>
     </w:p>
     <w:p>
@@ -158,16 +127,118 @@
       </w:r>
     </w:p>
     <w:bookmarkEnd w:id="9"/>
-    <w:bookmarkStart w:id="12" w:name="chapter-one-why-taiwan-needs-this-act"/>
+    <w:bookmarkStart w:id="10" w:name="preface-june-3rd"/>
     <w:p>
       <w:pPr>
         <w:pStyle w:val="Heading2"/>
       </w:pPr>
       <w:r>
+        <w:t xml:space="preserve">Preface: June 3rd</w:t>
+      </w:r>
+    </w:p>
+    <w:p>
+      <w:pPr>
+        <w:pStyle w:val="FirstParagraph"/>
+      </w:pPr>
+      <w:r>
+        <w:t xml:space="preserve">A little past ten in the morning, in the Finance Committee meeting room of the Legislative Yuan, I watched the staff read the thick draft clauses one by one, and I watched the chair bring down the gavel on the review's passage. My feelings were complicated.</w:t>
+      </w:r>
+    </w:p>
+    <w:p>
+      <w:pPr>
+        <w:pStyle w:val="BodyText"/>
+      </w:pPr>
+      <w:r>
+        <w:t xml:space="preserve">It wasn't the joy of "winning a war." It felt more like finally crossing a relay point in a long-distance run — you know there is still the second reading, the third reading, the secondary legislation, the first VASP license, the first enforcement action, the first victim's restitution case, and each of those will be another challenge. But you also know that this relay point cannot be retreated from.</w:t>
+      </w:r>
+    </w:p>
+    <w:p>
+      <w:pPr>
+        <w:pStyle w:val="BodyText"/>
+      </w:pPr>
+      <w:r>
+        <w:t xml:space="preserve">Over the past eight years, I went from academia to Dentsu, from Dentsu to parliament, from a person who wrote code to a person who wrote bills. I watched Taiwan's virtual asset industry grow from a grassroots era, through the AML registration era, into today — an era where it finally has its own dedicated statute. The 56 clauses that passed review today will determine how many service providers can survive on this island, how many investors will be able to recover what they really lost after being defrauded, how many stablecoins will be allowed to circulate legally in Taiwan, and how many new technologies will</w:t>
+      </w:r>
+      <w:r>
+        <w:t xml:space="preserve"> </w:t>
+      </w:r>
+      <w:r>
+        <w:rPr>
+          <w:i/>
+          <w:iCs/>
+        </w:rPr>
+        <w:t xml:space="preserve">not</w:t>
+      </w:r>
+      <w:r>
+        <w:t xml:space="preserve"> </w:t>
+      </w:r>
+      <w:r>
+        <w:t xml:space="preserve">be killed accidentally by the law.</w:t>
+      </w:r>
+    </w:p>
+    <w:p>
+      <w:pPr>
+        <w:pStyle w:val="BodyText"/>
+      </w:pPr>
+      <w:r>
+        <w:t xml:space="preserve">There is one thing I am certain of:</w:t>
+      </w:r>
+      <w:r>
+        <w:t xml:space="preserve"> </w:t>
+      </w:r>
+      <w:r>
+        <w:rPr>
+          <w:b/>
+          <w:bCs/>
+        </w:rPr>
+        <w:t xml:space="preserve">every word of this law eventually lands on people — users, operators, victims, future founders. The clauses themselves are not the point; the people are</w:t>
+      </w:r>
+      <w:r>
+        <w:t xml:space="preserve">.</w:t>
+      </w:r>
+    </w:p>
+    <w:p>
+      <w:pPr>
+        <w:pStyle w:val="BodyText"/>
+      </w:pPr>
+      <w:r>
+        <w:t xml:space="preserve">So in this notebook, I want to honestly write down my "thinking" and my "substantive contributions" on this law. Which fights I held the line on and where the text actually changed; which fights I retreated on but managed to preserve in spirit through supplementary resolutions or legislative explanations; which fights I lost and now have to put on the to-do list for later.</w:t>
+      </w:r>
+    </w:p>
+    <w:p>
+      <w:pPr>
+        <w:pStyle w:val="BodyText"/>
+      </w:pPr>
+      <w:r>
+        <w:t xml:space="preserve">I do not want to write this in the tone of a political press release. This law is too important to be wrapped in empty words.</w:t>
+      </w:r>
+    </w:p>
+    <w:p>
+      <w:pPr>
+        <w:pStyle w:val="BodyText"/>
+      </w:pPr>
+      <w:r>
+        <w:t xml:space="preserve">This piece is long, because every clause in this law deserves a serious accounting. If you only want the conclusion, jump to the influence-rating table at the end. If you are willing to walk the journey with me, start from Chapter One.</w:t>
+      </w:r>
+    </w:p>
+    <w:p>
+      <w:r>
+        <w:pict>
+          <v:rect style="width:0;height:1.5pt" o:hralign="center" o:hrstd="t" o:hr="t"/>
+        </w:pict>
+      </w:r>
+    </w:p>
+    <w:bookmarkEnd w:id="10"/>
+    <w:bookmarkStart w:id="13" w:name="chapter-one-why-taiwan-needs-this-act"/>
+    <w:p>
+      <w:pPr>
+        <w:pStyle w:val="Heading2"/>
+      </w:pPr>
+      <w:r>
         <w:t xml:space="preserve">Chapter One: Why Taiwan Needs This Act</w:t>
       </w:r>
     </w:p>
-    <w:bookmarkStart w:id="10" w:name="X30781f472bc04bd328b7135d32e154280309d31"/>
+    <w:bookmarkStart w:id="11" w:name="X30781f472bc04bd328b7135d32e154280309d31"/>
     <w:p>
       <w:pPr>
         <w:pStyle w:val="Heading3"/>
@@ -497,8 +568,8 @@
         <w:t xml:space="preserve">.</w:t>
       </w:r>
     </w:p>
-    <w:bookmarkEnd w:id="10"/>
-    <w:bookmarkStart w:id="11" w:name="why-i-introduced-my-bill-on-march-20"/>
+    <w:bookmarkEnd w:id="11"/>
+    <w:bookmarkStart w:id="12" w:name="why-i-introduced-my-bill-on-march-20"/>
     <w:p>
       <w:pPr>
         <w:pStyle w:val="Heading3"/>
@@ -1328,9 +1399,9 @@
         </w:pict>
       </w:r>
     </w:p>
-    <w:bookmarkEnd w:id="11"/>
     <w:bookmarkEnd w:id="12"/>
-    <w:bookmarkStart w:id="45" w:name="chapter-two-six-key-battles"/>
+    <w:bookmarkEnd w:id="13"/>
+    <w:bookmarkStart w:id="46" w:name="chapter-two-six-key-battles"/>
     <w:p>
       <w:pPr>
         <w:pStyle w:val="Heading2"/>
@@ -1347,7 +1418,7 @@
         <w:t xml:space="preserve">I have picked out the six clauses from this review whose policy significance was the greatest and whose battles had the best stories. Let me show you what really happened on the floor.</w:t>
       </w:r>
     </w:p>
-    <w:bookmarkStart w:id="18" w:name="X77c738badf090d463f906d5be99f25d8961a073"/>
+    <w:bookmarkStart w:id="19" w:name="X77c738badf090d463f906d5be99f25d8961a073"/>
     <w:p>
       <w:pPr>
         <w:pStyle w:val="Heading3"/>
@@ -1364,7 +1435,7 @@
         <w:t xml:space="preserve">If I could only single out one clause that I cared about most, it would be Article 25.</w:t>
       </w:r>
     </w:p>
-    <w:bookmarkStart w:id="13" w:name="what-the-executive-yuan-version-said"/>
+    <w:bookmarkStart w:id="14" w:name="what-the-executive-yuan-version-said"/>
     <w:p>
       <w:pPr>
         <w:pStyle w:val="Heading4"/>
@@ -1423,8 +1494,8 @@
         <w:t xml:space="preserve">every single token, before a platform can list it, must first be greenlit by the FSC.</w:t>
       </w:r>
     </w:p>
-    <w:bookmarkEnd w:id="13"/>
-    <w:bookmarkStart w:id="14" w:name="why-i-fought-this-one"/>
+    <w:bookmarkEnd w:id="14"/>
+    <w:bookmarkStart w:id="15" w:name="why-i-fought-this-one"/>
     <w:p>
       <w:pPr>
         <w:pStyle w:val="Heading4"/>
@@ -1738,8 +1809,8 @@
         <w:t xml:space="preserve">「這些國家都沒有這種『還需主管機關同意才能上架』的規範，金管會實在不需要特立獨行。」</w:t>
       </w:r>
     </w:p>
-    <w:bookmarkEnd w:id="14"/>
-    <w:bookmarkStart w:id="15" w:name="the-exchange-on-the-floor"/>
+    <w:bookmarkEnd w:id="15"/>
+    <w:bookmarkStart w:id="16" w:name="the-exchange-on-the-floor"/>
     <w:p>
       <w:pPr>
         <w:pStyle w:val="Heading4"/>
@@ -1998,8 +2069,8 @@
         <w:t xml:space="preserve">.</w:t>
       </w:r>
     </w:p>
-    <w:bookmarkEnd w:id="15"/>
-    <w:bookmarkStart w:id="16" w:name="result"/>
+    <w:bookmarkEnd w:id="16"/>
+    <w:bookmarkStart w:id="17" w:name="result"/>
     <w:p>
       <w:pPr>
         <w:pStyle w:val="Heading4"/>
@@ -2085,8 +2156,8 @@
         <w:t xml:space="preserve">That way the risk of "no time limit means industry gets stuck" was patched as well.</w:t>
       </w:r>
     </w:p>
-    <w:bookmarkEnd w:id="16"/>
-    <w:bookmarkStart w:id="17" w:name="why-this-fight-has-lasting-impact"/>
+    <w:bookmarkEnd w:id="17"/>
+    <w:bookmarkStart w:id="18" w:name="why-this-fight-has-lasting-impact"/>
     <w:p>
       <w:pPr>
         <w:pStyle w:val="Heading4"/>
@@ -2173,9 +2244,9 @@
         </w:pict>
       </w:r>
     </w:p>
-    <w:bookmarkEnd w:id="17"/>
     <w:bookmarkEnd w:id="18"/>
-    <w:bookmarkStart w:id="23" w:name="X005ed7551350fede67054b778d16c1864bd3748"/>
+    <w:bookmarkEnd w:id="19"/>
+    <w:bookmarkStart w:id="24" w:name="X005ed7551350fede67054b778d16c1864bd3748"/>
     <w:p>
       <w:pPr>
         <w:pStyle w:val="Heading3"/>
@@ -2205,7 +2276,7 @@
         <w:t xml:space="preserve">. But I want to write it honestly, because this clause touched the value I care about most: due process protection for citizens' property rights.</w:t>
       </w:r>
     </w:p>
-    <w:bookmarkStart w:id="19" w:name="why-this-is-needed"/>
+    <w:bookmarkStart w:id="20" w:name="why-this-is-needed"/>
     <w:p>
       <w:pPr>
         <w:pStyle w:val="Heading4"/>
@@ -2287,8 +2358,8 @@
         <w:t xml:space="preserve">If VASPs have no time-limit rule, they will become the digital version of "warning-flagged bank accounts."</w:t>
       </w:r>
     </w:p>
-    <w:bookmarkEnd w:id="19"/>
-    <w:bookmarkStart w:id="20" w:name="the-text-i-proposed"/>
+    <w:bookmarkEnd w:id="20"/>
+    <w:bookmarkStart w:id="21" w:name="the-text-i-proposed"/>
     <w:p>
       <w:pPr>
         <w:pStyle w:val="Heading4"/>
@@ -2421,8 +2492,8 @@
         <w:t xml:space="preserve">— from the Chinese original.</w:t>
       </w:r>
     </w:p>
-    <w:bookmarkEnd w:id="20"/>
-    <w:bookmarkStart w:id="21" w:name="the-exchange-and-result"/>
+    <w:bookmarkEnd w:id="21"/>
+    <w:bookmarkStart w:id="22" w:name="the-exchange-and-result"/>
     <w:p>
       <w:pPr>
         <w:pStyle w:val="Heading4"/>
@@ -2481,8 +2552,8 @@
         <w:t xml:space="preserve">There is no 20-day limit.</w:t>
       </w:r>
     </w:p>
-    <w:bookmarkEnd w:id="21"/>
-    <w:bookmarkStart w:id="22" w:name="my-reflection"/>
+    <w:bookmarkEnd w:id="22"/>
+    <w:bookmarkStart w:id="23" w:name="my-reflection"/>
     <w:p>
       <w:pPr>
         <w:pStyle w:val="Heading4"/>
@@ -2596,9 +2667,9 @@
         </w:pict>
       </w:r>
     </w:p>
-    <w:bookmarkEnd w:id="22"/>
     <w:bookmarkEnd w:id="23"/>
-    <w:bookmarkStart w:id="28" w:name="X2a3cd594d2a5eaecdcb523e6f0f25605721bbe4"/>
+    <w:bookmarkEnd w:id="24"/>
+    <w:bookmarkStart w:id="29" w:name="X2a3cd594d2a5eaecdcb523e6f0f25605721bbe4"/>
     <w:p>
       <w:pPr>
         <w:pStyle w:val="Heading3"/>
@@ -2628,7 +2699,7 @@
         <w:t xml:space="preserve">.</w:t>
       </w:r>
     </w:p>
-    <w:bookmarkStart w:id="24" w:name="the-core-problem"/>
+    <w:bookmarkStart w:id="25" w:name="the-core-problem"/>
     <w:p>
       <w:pPr>
         <w:pStyle w:val="Heading4"/>
@@ -2854,8 +2925,8 @@
         <w:t xml:space="preserve">should prosecutors really be guaranteeing market prices?</w:t>
       </w:r>
     </w:p>
-    <w:bookmarkEnd w:id="24"/>
-    <w:bookmarkStart w:id="25" w:name="my-proposal"/>
+    <w:bookmarkEnd w:id="25"/>
+    <w:bookmarkStart w:id="26" w:name="my-proposal"/>
     <w:p>
       <w:pPr>
         <w:pStyle w:val="Heading4"/>
@@ -2901,8 +2972,8 @@
         <w:t xml:space="preserve">And I prepared a complete debate strategy, because I knew that both the FSC and the Ministry of Justice would push back.</w:t>
       </w:r>
     </w:p>
-    <w:bookmarkEnd w:id="25"/>
-    <w:bookmarkStart w:id="26" w:name="X7d23c059ea3a4fefb5352dc30da9baaa796846a"/>
+    <w:bookmarkEnd w:id="26"/>
+    <w:bookmarkStart w:id="27" w:name="X7d23c059ea3a4fefb5352dc30da9baaa796846a"/>
     <w:p>
       <w:pPr>
         <w:pStyle w:val="Heading4"/>
@@ -3178,8 +3249,8 @@
         <w:t xml:space="preserve">This is a "principle plus exception" design, consistent with proportionality: the principle respects in-kind return, the exception allows liquidation only with due process.</w:t>
       </w:r>
     </w:p>
-    <w:bookmarkEnd w:id="26"/>
-    <w:bookmarkStart w:id="27" w:name="result-1"/>
+    <w:bookmarkEnd w:id="27"/>
+    <w:bookmarkStart w:id="28" w:name="result-1"/>
     <w:p>
       <w:pPr>
         <w:pStyle w:val="Heading4"/>
@@ -3343,9 +3414,9 @@
         </w:pict>
       </w:r>
     </w:p>
-    <w:bookmarkEnd w:id="27"/>
     <w:bookmarkEnd w:id="28"/>
-    <w:bookmarkStart w:id="34" w:name="X1420e757539e2ed12d04cde1e2da1f31ad8921e"/>
+    <w:bookmarkEnd w:id="29"/>
+    <w:bookmarkStart w:id="35" w:name="X1420e757539e2ed12d04cde1e2da1f31ad8921e"/>
     <w:p>
       <w:pPr>
         <w:pStyle w:val="Heading3"/>
@@ -3372,7 +3443,7 @@
         <w:t xml:space="preserve">the regulatory flexibility proviso.</w:t>
       </w:r>
     </w:p>
-    <w:bookmarkStart w:id="29" w:name="why-we-need-it"/>
+    <w:bookmarkStart w:id="30" w:name="why-we-need-it"/>
     <w:p>
       <w:pPr>
         <w:pStyle w:val="Heading4"/>
@@ -3507,8 +3578,8 @@
         <w:t xml:space="preserve">the law deliberately pushes the market underground.</w:t>
       </w:r>
     </w:p>
-    <w:bookmarkEnd w:id="29"/>
-    <w:bookmarkStart w:id="30" w:name="my-design"/>
+    <w:bookmarkEnd w:id="30"/>
+    <w:bookmarkStart w:id="31" w:name="my-design"/>
     <w:p>
       <w:pPr>
         <w:pStyle w:val="Heading4"/>
@@ -3654,8 +3725,8 @@
         <w:t xml:space="preserve">— it does not force the FSC to relax. It gives the FSC an exit so it can do fine-grained classification in the secondary legislation.</w:t>
       </w:r>
     </w:p>
-    <w:bookmarkEnd w:id="30"/>
-    <w:bookmarkStart w:id="31" w:name="on-the-floor"/>
+    <w:bookmarkEnd w:id="31"/>
+    <w:bookmarkStart w:id="32" w:name="on-the-floor"/>
     <w:p>
       <w:pPr>
         <w:pStyle w:val="Heading4"/>
@@ -3762,8 +3833,8 @@
         <w:t xml:space="preserve">The FSC's answer shifted from objection to "we can reconsider."</w:t>
       </w:r>
     </w:p>
-    <w:bookmarkEnd w:id="31"/>
-    <w:bookmarkStart w:id="32" w:name="result-2"/>
+    <w:bookmarkEnd w:id="32"/>
+    <w:bookmarkStart w:id="33" w:name="result-2"/>
     <w:p>
       <w:pPr>
         <w:pStyle w:val="Heading4"/>
@@ -3886,8 +3957,8 @@
         <w:t xml:space="preserve">: the FSC has administrative discretion to grant exceptions based on its professional judgment.</w:t>
       </w:r>
     </w:p>
-    <w:bookmarkEnd w:id="32"/>
-    <w:bookmarkStart w:id="33" w:name="impact"/>
+    <w:bookmarkEnd w:id="33"/>
+    <w:bookmarkStart w:id="34" w:name="impact"/>
     <w:p>
       <w:pPr>
         <w:pStyle w:val="Heading4"/>
@@ -3971,9 +4042,9 @@
         </w:pict>
       </w:r>
     </w:p>
-    <w:bookmarkEnd w:id="33"/>
     <w:bookmarkEnd w:id="34"/>
-    <w:bookmarkStart w:id="39" w:name="X4a3046510144373a71629a01b372d5fc14089d3"/>
+    <w:bookmarkEnd w:id="35"/>
+    <w:bookmarkStart w:id="40" w:name="X4a3046510144373a71629a01b372d5fc14089d3"/>
     <w:p>
       <w:pPr>
         <w:pStyle w:val="Heading3"/>
@@ -3990,7 +4061,7 @@
         <w:t xml:space="preserve">I won this one cleanly. The fight itself was not dramatic, but its significance runs deep.</w:t>
       </w:r>
     </w:p>
-    <w:bookmarkStart w:id="35" w:name="the-gap-in-the-executive-yuan-version"/>
+    <w:bookmarkStart w:id="36" w:name="the-gap-in-the-executive-yuan-version"/>
     <w:p>
       <w:pPr>
         <w:pStyle w:val="Heading4"/>
@@ -4075,8 +4146,8 @@
         <w:t xml:space="preserve">From the Executive Yuan text, you cannot tell. The customer would get bounced around: "The custodian you contracted with says it's the sub-custodian's responsibility. The sub-custodian says it has already gone bankrupt. Go back to the main custodian. The main custodian says it has already notified you."</w:t>
       </w:r>
     </w:p>
-    <w:bookmarkEnd w:id="35"/>
-    <w:bookmarkStart w:id="36" w:name="my-proposal-1"/>
+    <w:bookmarkEnd w:id="36"/>
+    <w:bookmarkStart w:id="37" w:name="my-proposal-1"/>
     <w:p>
       <w:pPr>
         <w:pStyle w:val="Heading4"/>
@@ -4187,8 +4258,8 @@
         <w:t xml:space="preserve">, or first-line consumers will never out-lawyer the operators' legal departments.</w:t>
       </w:r>
     </w:p>
-    <w:bookmarkEnd w:id="36"/>
-    <w:bookmarkStart w:id="37" w:name="result-3"/>
+    <w:bookmarkEnd w:id="37"/>
+    <w:bookmarkStart w:id="38" w:name="result-3"/>
     <w:p>
       <w:pPr>
         <w:pStyle w:val="Heading4"/>
@@ -4260,8 +4331,8 @@
         <w:t xml:space="preserve">the spirit is one hundred percent the KO version.</w:t>
       </w:r>
     </w:p>
-    <w:bookmarkEnd w:id="37"/>
-    <w:bookmarkStart w:id="38" w:name="impact-1"/>
+    <w:bookmarkEnd w:id="38"/>
+    <w:bookmarkStart w:id="39" w:name="impact-1"/>
     <w:p>
       <w:pPr>
         <w:pStyle w:val="Heading4"/>
@@ -4321,9 +4392,9 @@
         </w:pict>
       </w:r>
     </w:p>
-    <w:bookmarkEnd w:id="38"/>
     <w:bookmarkEnd w:id="39"/>
-    <w:bookmarkStart w:id="44" w:name="X3895a340c52abd5a1ab850156412ae8236cc13f"/>
+    <w:bookmarkEnd w:id="40"/>
+    <w:bookmarkStart w:id="45" w:name="X3895a340c52abd5a1ab850156412ae8236cc13f"/>
     <w:p>
       <w:pPr>
         <w:pStyle w:val="Heading3"/>
@@ -4356,7 +4427,7 @@
         <w:t xml:space="preserve">But I held the spirit.</w:t>
       </w:r>
     </w:p>
-    <w:bookmarkStart w:id="40" w:name="why-i-wanted-this-clause"/>
+    <w:bookmarkStart w:id="41" w:name="why-i-wanted-this-clause"/>
     <w:p>
       <w:pPr>
         <w:pStyle w:val="Heading4"/>
@@ -4584,8 +4655,8 @@
         <w:t xml:space="preserve">The spirit of Article 33's extension of education and outreach to the public will become hollow without funding support.</w:t>
       </w:r>
     </w:p>
-    <w:bookmarkEnd w:id="40"/>
-    <w:bookmarkStart w:id="41" w:name="why-i-gave-way"/>
+    <w:bookmarkEnd w:id="41"/>
+    <w:bookmarkStart w:id="42" w:name="why-i-gave-way"/>
     <w:p>
       <w:pPr>
         <w:pStyle w:val="Heading4"/>
@@ -4735,8 +4806,8 @@
         <w:t xml:space="preserve">— from the Chinese original.</w:t>
       </w:r>
     </w:p>
-    <w:bookmarkEnd w:id="41"/>
-    <w:bookmarkStart w:id="42" w:name="result-4"/>
+    <w:bookmarkEnd w:id="42"/>
+    <w:bookmarkStart w:id="43" w:name="result-4"/>
     <w:p>
       <w:pPr>
         <w:pStyle w:val="Heading4"/>
@@ -4767,8 +4838,8 @@
         <w:t xml:space="preserve">"The Financial Supervisory Commission shall, when amending the FinTech Development and Innovation Experimentation Act, add the establishment of a FinTech Innovation Development Fund, the uses of which shall be subsidizing FinTech research and development, cultivating financial technology talent, and subsidizing trade associations to conduct education and outreach, so as to promote our country's FinTech innovation, enhance digital financial resilience, and strengthen our international competitiveness."</w:t>
       </w:r>
     </w:p>
-    <w:bookmarkEnd w:id="42"/>
-    <w:bookmarkStart w:id="43" w:name="my-reflection-1"/>
+    <w:bookmarkEnd w:id="43"/>
+    <w:bookmarkStart w:id="44" w:name="my-reflection-1"/>
     <w:p>
       <w:pPr>
         <w:pStyle w:val="Heading4"/>
@@ -4871,10 +4942,10 @@
         </w:pict>
       </w:r>
     </w:p>
-    <w:bookmarkEnd w:id="43"/>
     <w:bookmarkEnd w:id="44"/>
     <w:bookmarkEnd w:id="45"/>
-    <w:bookmarkStart w:id="48" w:name="Xd9db599966a784bd5b0733232eac9193c673960"/>
+    <w:bookmarkEnd w:id="46"/>
+    <w:bookmarkStart w:id="49" w:name="Xd9db599966a784bd5b0733232eac9193c673960"/>
     <w:p>
       <w:pPr>
         <w:pStyle w:val="Heading2"/>
@@ -5057,7 +5128,7 @@
         <w:t xml:space="preserve">into political memory.</w:t>
       </w:r>
     </w:p>
-    <w:bookmarkStart w:id="46" w:name="classification-and-my-role"/>
+    <w:bookmarkStart w:id="47" w:name="classification-and-my-role"/>
     <w:p>
       <w:pPr>
         <w:pStyle w:val="Heading3"/>
@@ -5552,8 +5623,8 @@
         <w:t xml:space="preserve">This corresponds to the market manipulation exemption in my Article 42, Paragraph 4. It clarifies the legal nature of stablecoins so they do not drift between different financial statutes.</w:t>
       </w:r>
     </w:p>
-    <w:bookmarkEnd w:id="46"/>
-    <w:bookmarkStart w:id="47" w:name="adding-it-all-up"/>
+    <w:bookmarkEnd w:id="47"/>
+    <w:bookmarkStart w:id="48" w:name="adding-it-all-up"/>
     <w:p>
       <w:pPr>
         <w:pStyle w:val="Heading3"/>
@@ -5629,9 +5700,9 @@
         </w:pict>
       </w:r>
     </w:p>
-    <w:bookmarkEnd w:id="47"/>
     <w:bookmarkEnd w:id="48"/>
-    <w:bookmarkStart w:id="57" w:name="X05db196308b5a2d36b00a04c2fe85d4beeb734d"/>
+    <w:bookmarkEnd w:id="49"/>
+    <w:bookmarkStart w:id="58" w:name="X05db196308b5a2d36b00a04c2fe85d4beeb734d"/>
     <w:p>
       <w:pPr>
         <w:pStyle w:val="Heading2"/>
@@ -5666,7 +5737,7 @@
         <w:t xml:space="preserve">"A top student in the middle tier."</w:t>
       </w:r>
     </w:p>
-    <w:bookmarkStart w:id="49" w:name="versus-mica"/>
+    <w:bookmarkStart w:id="50" w:name="versus-mica"/>
     <w:p>
       <w:pPr>
         <w:pStyle w:val="Heading3"/>
@@ -5807,8 +5878,8 @@
         <w:t xml:space="preserve">.</w:t>
       </w:r>
     </w:p>
-    <w:bookmarkEnd w:id="49"/>
-    <w:bookmarkStart w:id="50" w:name="versus-the-us-genius-act"/>
+    <w:bookmarkEnd w:id="50"/>
+    <w:bookmarkStart w:id="51" w:name="versus-the-us-genius-act"/>
     <w:p>
       <w:pPr>
         <w:pStyle w:val="Heading3"/>
@@ -5900,8 +5971,8 @@
         <w:t xml:space="preserve">This is where Taiwan is more pragmatic than GENIUS.</w:t>
       </w:r>
     </w:p>
-    <w:bookmarkEnd w:id="50"/>
-    <w:bookmarkStart w:id="51" w:name="versus-japans-psa"/>
+    <w:bookmarkEnd w:id="51"/>
+    <w:bookmarkStart w:id="52" w:name="versus-japans-psa"/>
     <w:p>
       <w:pPr>
         <w:pStyle w:val="Heading3"/>
@@ -5983,8 +6054,8 @@
         <w:t xml:space="preserve">But Japan took 8 years to build today's framework. Taiwan walked the same path in 8 months — relying on borrowing and rapid integration.</w:t>
       </w:r>
     </w:p>
-    <w:bookmarkEnd w:id="51"/>
-    <w:bookmarkStart w:id="52" w:name="versus-south-koreas-vaupa"/>
+    <w:bookmarkEnd w:id="52"/>
+    <w:bookmarkStart w:id="53" w:name="versus-south-koreas-vaupa"/>
     <w:p>
       <w:pPr>
         <w:pStyle w:val="Heading3"/>
@@ -6019,8 +6090,8 @@
         <w:t xml:space="preserve">From a certain angle, Taiwan is more comprehensive than Korea — VAUPA does not address stablecoins, does not address trade associations, does not address concurrent operation by financial institutions. Taiwan's law covers all of these.</w:t>
       </w:r>
     </w:p>
-    <w:bookmarkEnd w:id="52"/>
-    <w:bookmarkStart w:id="53" w:name="versus-hong-kongs-stablecoins-ordinance"/>
+    <w:bookmarkEnd w:id="53"/>
+    <w:bookmarkStart w:id="54" w:name="versus-hong-kongs-stablecoins-ordinance"/>
     <w:p>
       <w:pPr>
         <w:pStyle w:val="Heading3"/>
@@ -6050,8 +6121,8 @@
         <w:t xml:space="preserve">: Article 35 permits foreign stablecoins to circulate in Taiwan after approval by the competent authority.</w:t>
       </w:r>
     </w:p>
-    <w:bookmarkEnd w:id="53"/>
-    <w:bookmarkStart w:id="54" w:name="taiwans-strengths"/>
+    <w:bookmarkEnd w:id="54"/>
+    <w:bookmarkStart w:id="55" w:name="taiwans-strengths"/>
     <w:p>
       <w:pPr>
         <w:pStyle w:val="Heading3"/>
@@ -6162,8 +6233,8 @@
         <w:t xml:space="preserve">" dual-track regime — a uniquely Taiwanese legislative capability.</w:t>
       </w:r>
     </w:p>
-    <w:bookmarkEnd w:id="54"/>
-    <w:bookmarkStart w:id="55" w:name="taiwans-challenges"/>
+    <w:bookmarkEnd w:id="55"/>
+    <w:bookmarkStart w:id="56" w:name="taiwans-challenges"/>
     <w:p>
       <w:pPr>
         <w:pStyle w:val="Heading3"/>
@@ -6290,8 +6361,8 @@
         <w:t xml:space="preserve">: a draft within a year is the floor, but actual implementation will take longer.</w:t>
       </w:r>
     </w:p>
-    <w:bookmarkEnd w:id="55"/>
-    <w:bookmarkStart w:id="56" w:name="X5724ce3ed970d31a3ee5a21547b9290c6c54a57"/>
+    <w:bookmarkEnd w:id="56"/>
+    <w:bookmarkStart w:id="57" w:name="X5724ce3ed970d31a3ee5a21547b9290c6c54a57"/>
     <w:p>
       <w:pPr>
         <w:pStyle w:val="Heading3"/>
@@ -6377,9 +6448,9 @@
         </w:pict>
       </w:r>
     </w:p>
-    <w:bookmarkEnd w:id="56"/>
     <w:bookmarkEnd w:id="57"/>
-    <w:bookmarkStart w:id="61" w:name="X371fbef9652975c658821dc83859eae2f696fb6"/>
+    <w:bookmarkEnd w:id="58"/>
+    <w:bookmarkStart w:id="62" w:name="X371fbef9652975c658821dc83859eae2f696fb6"/>
     <w:p>
       <w:pPr>
         <w:pStyle w:val="Heading2"/>
@@ -6388,7 +6459,7 @@
         <w:t xml:space="preserve">Chapter Five: Thanks, Reflections, the Future</w:t>
       </w:r>
     </w:p>
-    <w:bookmarkStart w:id="58" w:name="thanks"/>
+    <w:bookmarkStart w:id="59" w:name="thanks"/>
     <w:p>
       <w:pPr>
         <w:pStyle w:val="Heading3"/>
@@ -6648,8 +6719,8 @@
         <w:t xml:space="preserve">The legal team, the policy research team, the communications team — three months of running the VASP project together with me. Without you translating MiCA, comparing Korean VAUPA, tracking GENIUS, and producing the 22-clause amendment comparison chart, I could not have cited comparative law on demand in 76 prepared speeches during the review.</w:t>
       </w:r>
     </w:p>
-    <w:bookmarkEnd w:id="58"/>
-    <w:bookmarkStart w:id="59" w:name="Xc1a8f0e4a3b55f7e9ce73034eea1218d6414492"/>
+    <w:bookmarkEnd w:id="59"/>
+    <w:bookmarkStart w:id="60" w:name="Xc1a8f0e4a3b55f7e9ce73034eea1218d6414492"/>
     <w:p>
       <w:pPr>
         <w:pStyle w:val="Heading3"/>
@@ -6936,8 +7007,8 @@
         <w:t xml:space="preserve">."</w:t>
       </w:r>
     </w:p>
-    <w:bookmarkEnd w:id="59"/>
-    <w:bookmarkStart w:id="60" w:name="Xd358c808bcd6649911404a639364bdd7c7b55e8"/>
+    <w:bookmarkEnd w:id="60"/>
+    <w:bookmarkStart w:id="61" w:name="Xd358c808bcd6649911404a639364bdd7c7b55e8"/>
     <w:p>
       <w:pPr>
         <w:pStyle w:val="Heading3"/>
@@ -7151,9 +7222,9 @@
         </w:pict>
       </w:r>
     </w:p>
-    <w:bookmarkEnd w:id="60"/>
     <w:bookmarkEnd w:id="61"/>
-    <w:bookmarkStart w:id="62" w:name="X3797f09bdc9174f9386f4c771d17ea1e1cd4348"/>
+    <w:bookmarkEnd w:id="62"/>
+    <w:bookmarkStart w:id="63" w:name="X3797f09bdc9174f9386f4c771d17ea1e1cd4348"/>
     <w:p>
       <w:pPr>
         <w:pStyle w:val="Heading2"/>
@@ -7347,8 +7418,8 @@
         </w:pict>
       </w:r>
     </w:p>
-    <w:bookmarkEnd w:id="62"/>
-    <w:bookmarkStart w:id="63" w:name="appendix-a-legislative-timeline"/>
+    <w:bookmarkEnd w:id="63"/>
+    <w:bookmarkStart w:id="64" w:name="appendix-a-legislative-timeline"/>
     <w:p>
       <w:pPr>
         <w:pStyle w:val="Heading2"/>
@@ -7539,8 +7610,8 @@
         <w:t xml:space="preserve">Early 2028   Most existing operators expected to complete licensing (per Article 55's 12 + 21 + 3 months schedule)</w:t>
       </w:r>
     </w:p>
-    <w:bookmarkEnd w:id="63"/>
-    <w:bookmarkStart w:id="64" w:name="appendix-b-influence-rating-summary"/>
+    <w:bookmarkEnd w:id="64"/>
+    <w:bookmarkStart w:id="65" w:name="appendix-b-influence-rating-summary"/>
     <w:p>
       <w:pPr>
         <w:pStyle w:val="Heading2"/>
@@ -8766,8 +8837,8 @@
         </w:pict>
       </w:r>
     </w:p>
-    <w:bookmarkEnd w:id="64"/>
-    <w:bookmarkStart w:id="88" w:name="paperclip-files--downloads"/>
+    <w:bookmarkEnd w:id="65"/>
+    <w:bookmarkStart w:id="89" w:name="paperclip-files--downloads"/>
     <w:p>
       <w:pPr>
         <w:pStyle w:val="Heading2"/>
@@ -8784,7 +8855,7 @@
         <w:t xml:space="preserve">This law wasn't written by me alone, and it shouldn't be read by me alone. Below are the original materials, my bilingual edition, and the present essay — all publicly downloadable for scholars, industry, international readers, and future generations:</w:t>
       </w:r>
     </w:p>
-    <w:bookmarkStart w:id="69" w:name="this-essay-bilingual"/>
+    <w:bookmarkStart w:id="70" w:name="this-essay-bilingual"/>
     <w:p>
       <w:pPr>
         <w:pStyle w:val="Heading3"/>
@@ -8807,7 +8878,7 @@
       <w:r>
         <w:t xml:space="preserve"> </w:t>
       </w:r>
-      <w:hyperlink r:id="rId65">
+      <w:hyperlink r:id="rId66">
         <w:r>
           <w:rPr>
             <w:rStyle w:val="Hyperlink"/>
@@ -8830,7 +8901,7 @@
       <w:r>
         <w:t xml:space="preserve"> </w:t>
       </w:r>
-      <w:hyperlink r:id="rId66">
+      <w:hyperlink r:id="rId67">
         <w:r>
           <w:rPr>
             <w:rStyle w:val="Hyperlink"/>
@@ -8853,7 +8924,7 @@
       <w:r>
         <w:t xml:space="preserve"> </w:t>
       </w:r>
-      <w:hyperlink r:id="rId67">
+      <w:hyperlink r:id="rId68">
         <w:r>
           <w:rPr>
             <w:rStyle w:val="Hyperlink"/>
@@ -8883,7 +8954,7 @@
       <w:r>
         <w:t xml:space="preserve"> </w:t>
       </w:r>
-      <w:hyperlink r:id="rId68">
+      <w:hyperlink r:id="rId69">
         <w:r>
           <w:rPr>
             <w:rStyle w:val="Hyperlink"/>
@@ -8892,8 +8963,8 @@
         </w:r>
       </w:hyperlink>
     </w:p>
-    <w:bookmarkEnd w:id="69"/>
-    <w:bookmarkStart w:id="72" w:name="Xaffca0689bca2b04df93c1f203ad1557fc50602"/>
+    <w:bookmarkEnd w:id="70"/>
+    <w:bookmarkStart w:id="73" w:name="Xaffca0689bca2b04df93c1f203ad1557fc50602"/>
     <w:p>
       <w:pPr>
         <w:pStyle w:val="Heading3"/>
@@ -8916,7 +8987,7 @@
       <w:r>
         <w:t xml:space="preserve"> </w:t>
       </w:r>
-      <w:hyperlink r:id="rId70">
+      <w:hyperlink r:id="rId71">
         <w:r>
           <w:rPr>
             <w:rStyle w:val="Hyperlink"/>
@@ -8939,7 +9010,7 @@
       <w:r>
         <w:t xml:space="preserve"> </w:t>
       </w:r>
-      <w:hyperlink r:id="rId71">
+      <w:hyperlink r:id="rId72">
         <w:r>
           <w:rPr>
             <w:rStyle w:val="Hyperlink"/>
@@ -8948,8 +9019,8 @@
         </w:r>
       </w:hyperlink>
     </w:p>
-    <w:bookmarkEnd w:id="72"/>
-    <w:bookmarkStart w:id="76" w:name="X7e8e11b6c9befb7e8b0d2602778b8e9c99d9cbd"/>
+    <w:bookmarkEnd w:id="73"/>
+    <w:bookmarkStart w:id="77" w:name="X7e8e11b6c9befb7e8b0d2602778b8e9c99d9cbd"/>
     <w:p>
       <w:pPr>
         <w:pStyle w:val="Heading3"/>
@@ -8972,7 +9043,7 @@
       <w:r>
         <w:t xml:space="preserve"> </w:t>
       </w:r>
-      <w:hyperlink r:id="rId73">
+      <w:hyperlink r:id="rId74">
         <w:r>
           <w:rPr>
             <w:rStyle w:val="Hyperlink"/>
@@ -9004,7 +9075,7 @@
       <w:r>
         <w:t xml:space="preserve"> </w:t>
       </w:r>
-      <w:hyperlink r:id="rId74">
+      <w:hyperlink r:id="rId75">
         <w:r>
           <w:rPr>
             <w:rStyle w:val="Hyperlink"/>
@@ -9027,7 +9098,7 @@
       <w:r>
         <w:t xml:space="preserve"> </w:t>
       </w:r>
-      <w:hyperlink r:id="rId75">
+      <w:hyperlink r:id="rId76">
         <w:r>
           <w:rPr>
             <w:rStyle w:val="Hyperlink"/>
@@ -9036,8 +9107,8 @@
         </w:r>
       </w:hyperlink>
     </w:p>
-    <w:bookmarkEnd w:id="76"/>
-    <w:bookmarkStart w:id="84" w:name="international-comparative-law-references"/>
+    <w:bookmarkEnd w:id="77"/>
+    <w:bookmarkStart w:id="85" w:name="international-comparative-law-references"/>
     <w:p>
       <w:pPr>
         <w:pStyle w:val="Heading3"/>
@@ -9054,7 +9125,7 @@
           <w:numId w:val="1029"/>
         </w:numPr>
       </w:pPr>
-      <w:hyperlink r:id="rId77">
+      <w:hyperlink r:id="rId78">
         <w:r>
           <w:rPr>
             <w:rStyle w:val="Hyperlink"/>
@@ -9071,7 +9142,7 @@
           <w:numId w:val="1029"/>
         </w:numPr>
       </w:pPr>
-      <w:hyperlink r:id="rId78">
+      <w:hyperlink r:id="rId79">
         <w:r>
           <w:rPr>
             <w:rStyle w:val="Hyperlink"/>
@@ -9088,7 +9159,7 @@
           <w:numId w:val="1029"/>
         </w:numPr>
       </w:pPr>
-      <w:hyperlink r:id="rId79">
+      <w:hyperlink r:id="rId80">
         <w:r>
           <w:rPr>
             <w:rStyle w:val="Hyperlink"/>
@@ -9105,7 +9176,7 @@
           <w:numId w:val="1029"/>
         </w:numPr>
       </w:pPr>
-      <w:hyperlink r:id="rId80">
+      <w:hyperlink r:id="rId81">
         <w:r>
           <w:rPr>
             <w:rStyle w:val="Hyperlink"/>
@@ -9122,7 +9193,7 @@
           <w:numId w:val="1029"/>
         </w:numPr>
       </w:pPr>
-      <w:hyperlink r:id="rId81">
+      <w:hyperlink r:id="rId82">
         <w:r>
           <w:rPr>
             <w:rStyle w:val="Hyperlink"/>
@@ -9139,7 +9210,7 @@
           <w:numId w:val="1029"/>
         </w:numPr>
       </w:pPr>
-      <w:hyperlink r:id="rId82">
+      <w:hyperlink r:id="rId83">
         <w:r>
           <w:rPr>
             <w:rStyle w:val="Hyperlink"/>
@@ -9156,7 +9227,7 @@
           <w:numId w:val="1029"/>
         </w:numPr>
       </w:pPr>
-      <w:hyperlink r:id="rId83">
+      <w:hyperlink r:id="rId84">
         <w:r>
           <w:rPr>
             <w:rStyle w:val="Hyperlink"/>
@@ -9165,8 +9236,8 @@
         </w:r>
       </w:hyperlink>
     </w:p>
-    <w:bookmarkEnd w:id="84"/>
-    <w:bookmarkStart w:id="87" w:name="future-updates"/>
+    <w:bookmarkEnd w:id="85"/>
+    <w:bookmarkStart w:id="88" w:name="future-updates"/>
     <w:p>
       <w:pPr>
         <w:pStyle w:val="Heading3"/>
@@ -9201,7 +9272,7 @@
       <w:r>
         <w:t xml:space="preserve"> </w:t>
       </w:r>
-      <w:hyperlink r:id="rId85">
+      <w:hyperlink r:id="rId86">
         <w:r>
           <w:rPr>
             <w:rStyle w:val="Hyperlink"/>
@@ -9218,7 +9289,7 @@
       <w:r>
         <w:t xml:space="preserve"> </w:t>
       </w:r>
-      <w:hyperlink r:id="rId86">
+      <w:hyperlink r:id="rId87">
         <w:r>
           <w:rPr>
             <w:rStyle w:val="Hyperlink"/>
@@ -9233,9 +9304,9 @@
         <w:t xml:space="preserve">for the latest.</w:t>
       </w:r>
     </w:p>
-    <w:bookmarkEnd w:id="87"/>
     <w:bookmarkEnd w:id="88"/>
     <w:bookmarkEnd w:id="89"/>
+    <w:bookmarkEnd w:id="90"/>
     <w:sectPr>
       <w:footnotePr>
         <w:numRestart w:val="eachSect"/>

</xml_diff>